<commit_message>
Support revised application template group and schedule fields
</commit_message>
<xml_diff>
--- a/assets/活動申請書模板.docx
+++ b/assets/活動申請書模板.docx
@@ -19,27 +19,7 @@
           <w:sz w:val="56"/>
           <w:szCs w:val="56"/>
         </w:rPr>
-        <w:t>國立</w:t>
-      </w:r>
-      <w:proofErr w:type="gramStart"/>
-      <w:r>
-        <w:rPr>
-          <w:rFonts w:ascii="標楷體" w:eastAsia="標楷體" w:hAnsi="標楷體" w:cs="標楷體"/>
-          <w:color w:val="000000"/>
-          <w:sz w:val="56"/>
-          <w:szCs w:val="56"/>
-        </w:rPr>
-        <w:t>臺</w:t>
-      </w:r>
-      <w:proofErr w:type="gramEnd"/>
-      <w:r>
-        <w:rPr>
-          <w:rFonts w:ascii="標楷體" w:eastAsia="標楷體" w:hAnsi="標楷體" w:cs="標楷體"/>
-          <w:color w:val="000000"/>
-          <w:sz w:val="56"/>
-          <w:szCs w:val="56"/>
-        </w:rPr>
-        <w:t>東大學社團活動申請計畫書</w:t>
+        <w:t>國立臺東大學社團活動申請計畫書</w:t>
       </w:r>
     </w:p>
     <w:p>
@@ -1034,19 +1014,8 @@
                 <w:sz w:val="28"/>
                 <w:szCs w:val="28"/>
               </w:rPr>
-              <w:t>■人力關係能力■批判思考能力□國際視野能力□其他</w:t>
-            </w:r>
-            <w:proofErr w:type="gramStart"/>
-            <w:r>
-              <w:rPr>
-                <w:rFonts w:ascii="標楷體" w:eastAsia="標楷體" w:hAnsi="標楷體" w:cs="標楷體"/>
-                <w:color w:val="000000"/>
-                <w:sz w:val="28"/>
-                <w:szCs w:val="28"/>
-              </w:rPr>
-              <w:t>＿＿＿＿</w:t>
-            </w:r>
-            <w:proofErr w:type="gramEnd"/>
+              <w:t>■人力關係能力■批判思考能力□國際視野能力□其他＿＿＿＿</w:t>
+            </w:r>
           </w:p>
         </w:tc>
       </w:tr>
@@ -1181,19 +1150,8 @@
                 <w:sz w:val="28"/>
                 <w:szCs w:val="28"/>
               </w:rPr>
-              <w:t>□生涯規劃能力□其他</w:t>
-            </w:r>
-            <w:proofErr w:type="gramStart"/>
-            <w:r>
-              <w:rPr>
-                <w:rFonts w:ascii="標楷體" w:eastAsia="標楷體" w:hAnsi="標楷體" w:cs="標楷體"/>
-                <w:color w:val="000000"/>
-                <w:sz w:val="28"/>
-                <w:szCs w:val="28"/>
-              </w:rPr>
-              <w:t>＿＿＿＿</w:t>
-            </w:r>
-            <w:proofErr w:type="gramEnd"/>
+              <w:t>□生涯規劃能力□其他＿＿＿＿</w:t>
+            </w:r>
           </w:p>
         </w:tc>
       </w:tr>
@@ -1403,27 +1361,7 @@
                 <w:sz w:val="28"/>
                 <w:szCs w:val="28"/>
               </w:rPr>
-              <w:t>□</w:t>
-            </w:r>
-            <w:proofErr w:type="gramStart"/>
-            <w:r>
-              <w:rPr>
-                <w:rFonts w:ascii="標楷體" w:eastAsia="標楷體" w:hAnsi="標楷體" w:cs="標楷體"/>
-                <w:color w:val="000000"/>
-                <w:sz w:val="28"/>
-                <w:szCs w:val="28"/>
-              </w:rPr>
-              <w:t>社課</w:t>
-            </w:r>
-            <w:proofErr w:type="gramEnd"/>
-            <w:r>
-              <w:rPr>
-                <w:rFonts w:ascii="標楷體" w:eastAsia="標楷體" w:hAnsi="標楷體" w:cs="標楷體"/>
-                <w:color w:val="000000"/>
-                <w:sz w:val="28"/>
-                <w:szCs w:val="28"/>
-              </w:rPr>
-              <w:t>(訓練)</w:t>
+              <w:t>□社課(訓練)</w:t>
             </w:r>
           </w:p>
           <w:p>
@@ -1493,19 +1431,8 @@
                 <w:sz w:val="28"/>
                 <w:szCs w:val="28"/>
               </w:rPr>
-              <w:t>□其他：</w:t>
-            </w:r>
-            <w:proofErr w:type="gramStart"/>
-            <w:r>
-              <w:rPr>
-                <w:rFonts w:ascii="標楷體" w:eastAsia="標楷體" w:hAnsi="標楷體" w:cs="標楷體"/>
-                <w:color w:val="000000"/>
-                <w:sz w:val="28"/>
-                <w:szCs w:val="28"/>
-              </w:rPr>
-              <w:t>＿＿＿＿</w:t>
-            </w:r>
-            <w:proofErr w:type="gramEnd"/>
+              <w:t>□其他：＿＿＿＿</w:t>
+            </w:r>
           </w:p>
         </w:tc>
       </w:tr>
@@ -1985,27 +1912,7 @@
                 <w:sz w:val="28"/>
                 <w:szCs w:val="28"/>
               </w:rPr>
-              <w:t>參加對象：</w:t>
-            </w:r>
-            <w:proofErr w:type="gramStart"/>
-            <w:r>
-              <w:rPr>
-                <w:rFonts w:ascii="標楷體" w:eastAsia="標楷體" w:hAnsi="標楷體" w:cs="標楷體"/>
-                <w:color w:val="000000"/>
-                <w:sz w:val="28"/>
-                <w:szCs w:val="28"/>
-              </w:rPr>
-              <w:t>臺</w:t>
-            </w:r>
-            <w:proofErr w:type="gramEnd"/>
-            <w:r>
-              <w:rPr>
-                <w:rFonts w:ascii="標楷體" w:eastAsia="標楷體" w:hAnsi="標楷體" w:cs="標楷體"/>
-                <w:color w:val="000000"/>
-                <w:sz w:val="28"/>
-                <w:szCs w:val="28"/>
-              </w:rPr>
-              <w:t>東大學的學生</w:t>
+              <w:t>參加對象：臺東大學的學生</w:t>
             </w:r>
           </w:p>
           <w:p>
@@ -2292,23 +2199,7 @@
                 <w:rFonts w:ascii="標楷體" w:eastAsia="標楷體" w:hAnsi="標楷體" w:cs="標楷體"/>
                 <w:color w:val="000000"/>
               </w:rPr>
-              <w:t>統籌及撰寫活動企劃、分配工作執掌、掌握工作進度、</w:t>
-            </w:r>
-            <w:proofErr w:type="gramStart"/>
-            <w:r>
-              <w:rPr>
-                <w:rFonts w:ascii="標楷體" w:eastAsia="標楷體" w:hAnsi="標楷體" w:cs="標楷體"/>
-                <w:color w:val="000000"/>
-              </w:rPr>
-              <w:t>場控</w:t>
-            </w:r>
-            <w:proofErr w:type="gramEnd"/>
-            <w:r>
-              <w:rPr>
-                <w:rFonts w:ascii="標楷體" w:eastAsia="標楷體" w:hAnsi="標楷體" w:cs="標楷體"/>
-                <w:color w:val="000000"/>
-              </w:rPr>
-              <w:t>、活動成果記錄、製作成果報告</w:t>
+              <w:t>統籌及撰寫活動企劃、分配工作執掌、掌握工作進度、場控、活動成果記錄、製作成果報告</w:t>
             </w:r>
           </w:p>
         </w:tc>
@@ -2455,10 +2346,21 @@
             </w:pPr>
             <w:r>
               <w:rPr>
-                <w:rFonts w:ascii="標楷體" w:eastAsia="標楷體" w:hAnsi="標楷體" w:cs="標楷體"/>
-                <w:color w:val="000000"/>
-              </w:rPr>
-              <w:t>蔡欣君</w:t>
+                <w:rFonts w:ascii="標楷體" w:eastAsia="標楷體" w:hAnsi="標楷體"/>
+              </w:rPr>
+              <w:t>{{</w:t>
+            </w:r>
+            <w:r>
+              <w:rPr>
+                <w:rFonts w:ascii="標楷體" w:eastAsia="標楷體" w:hAnsi="標楷體" w:hint="eastAsia"/>
+              </w:rPr>
+              <w:t>社長</w:t>
+            </w:r>
+            <w:r>
+              <w:rPr>
+                <w:rFonts w:ascii="標楷體" w:eastAsia="標楷體" w:hAnsi="標楷體"/>
+              </w:rPr>
+              <w:t>}}</w:t>
             </w:r>
           </w:p>
         </w:tc>
@@ -2528,15 +2430,27 @@
                 <w:color w:val="000000"/>
               </w:rPr>
             </w:pPr>
-            <w:proofErr w:type="gramStart"/>
-            <w:r>
-              <w:rPr>
-                <w:rFonts w:ascii="標楷體" w:eastAsia="標楷體" w:hAnsi="標楷體" w:cs="標楷體"/>
-                <w:color w:val="000000"/>
-              </w:rPr>
-              <w:t>耿惠慈</w:t>
-            </w:r>
-            <w:proofErr w:type="gramEnd"/>
+            <w:r>
+              <w:rPr>
+                <w:rFonts w:ascii="標楷體" w:eastAsia="標楷體" w:hAnsi="標楷體"/>
+              </w:rPr>
+              <w:t>{{</w:t>
+            </w:r>
+            <w:r>
+              <w:rPr>
+                <w:rFonts w:ascii="標楷體" w:eastAsia="標楷體" w:hAnsi="標楷體" w:cs="標楷體"/>
+                <w:b/>
+                <w:bCs/>
+                <w:color w:val="000000"/>
+              </w:rPr>
+              <w:t>副社長</w:t>
+            </w:r>
+            <w:r>
+              <w:rPr>
+                <w:rFonts w:ascii="標楷體" w:eastAsia="標楷體" w:hAnsi="標楷體"/>
+              </w:rPr>
+              <w:t>}}</w:t>
+            </w:r>
           </w:p>
         </w:tc>
         <w:tc>
@@ -2581,7 +2495,6 @@
                 <w:color w:val="000000"/>
               </w:rPr>
             </w:pPr>
-            <w:proofErr w:type="gramStart"/>
             <w:r>
               <w:rPr>
                 <w:rFonts w:ascii="標楷體" w:eastAsia="標楷體" w:hAnsi="標楷體" w:cs="標楷體"/>
@@ -2591,7 +2504,6 @@
               </w:rPr>
               <w:t>美宣組</w:t>
             </w:r>
-            <w:proofErr w:type="gramEnd"/>
           </w:p>
         </w:tc>
         <w:tc>
@@ -2607,15 +2519,27 @@
                 <w:color w:val="000000"/>
               </w:rPr>
             </w:pPr>
-            <w:proofErr w:type="gramStart"/>
-            <w:r>
-              <w:rPr>
-                <w:rFonts w:ascii="標楷體" w:eastAsia="標楷體" w:hAnsi="標楷體" w:cs="標楷體"/>
-                <w:color w:val="000000"/>
-              </w:rPr>
-              <w:t>耿惠慈</w:t>
-            </w:r>
-            <w:proofErr w:type="gramEnd"/>
+            <w:r>
+              <w:rPr>
+                <w:rFonts w:ascii="標楷體" w:eastAsia="標楷體" w:hAnsi="標楷體"/>
+              </w:rPr>
+              <w:t>{{</w:t>
+            </w:r>
+            <w:r>
+              <w:rPr>
+                <w:rFonts w:ascii="標楷體" w:eastAsia="標楷體" w:hAnsi="標楷體" w:cs="標楷體"/>
+                <w:b/>
+                <w:bCs/>
+                <w:color w:val="000000"/>
+              </w:rPr>
+              <w:t>美宣組</w:t>
+            </w:r>
+            <w:r>
+              <w:rPr>
+                <w:rFonts w:ascii="標楷體" w:eastAsia="標楷體" w:hAnsi="標楷體"/>
+              </w:rPr>
+              <w:t>}}</w:t>
+            </w:r>
           </w:p>
         </w:tc>
         <w:tc>
@@ -2668,6 +2592,95 @@
                 <w:color w:val="000000"/>
               </w:rPr>
               <w:t>文書組</w:t>
+            </w:r>
+          </w:p>
+        </w:tc>
+        <w:tc>
+          <w:tcPr>
+            <w:tcW w:w="1599" w:type="dxa"/>
+            <w:vAlign w:val="center"/>
+          </w:tcPr>
+          <w:p>
+            <w:pPr>
+              <w:jc w:val="center"/>
+              <w:rPr>
+                <w:rFonts w:ascii="標楷體" w:eastAsia="標楷體" w:hAnsi="標楷體" w:cs="標楷體"/>
+                <w:color w:val="000000"/>
+              </w:rPr>
+            </w:pPr>
+            <w:r>
+              <w:rPr>
+                <w:rFonts w:ascii="標楷體" w:eastAsia="標楷體" w:hAnsi="標楷體"/>
+              </w:rPr>
+              <w:t>{{</w:t>
+            </w:r>
+            <w:r>
+              <w:rPr>
+                <w:rFonts w:ascii="標楷體" w:eastAsia="標楷體" w:hAnsi="標楷體" w:cs="標楷體"/>
+                <w:b/>
+                <w:bCs/>
+                <w:color w:val="000000"/>
+              </w:rPr>
+              <w:t>文書組</w:t>
+            </w:r>
+            <w:r>
+              <w:rPr>
+                <w:rFonts w:ascii="標楷體" w:eastAsia="標楷體" w:hAnsi="標楷體"/>
+              </w:rPr>
+              <w:t>}}</w:t>
+            </w:r>
+          </w:p>
+        </w:tc>
+        <w:tc>
+          <w:tcPr>
+            <w:tcW w:w="6708" w:type="dxa"/>
+            <w:vAlign w:val="center"/>
+          </w:tcPr>
+          <w:p>
+            <w:pPr>
+              <w:spacing w:line="300" w:lineRule="auto"/>
+              <w:jc w:val="both"/>
+              <w:rPr>
+                <w:rFonts w:ascii="標楷體" w:eastAsia="標楷體" w:hAnsi="標楷體" w:cs="標楷體"/>
+                <w:color w:val="000000"/>
+              </w:rPr>
+            </w:pPr>
+            <w:r>
+              <w:rPr>
+                <w:rFonts w:ascii="標楷體" w:eastAsia="標楷體" w:hAnsi="標楷體" w:cs="標楷體"/>
+                <w:color w:val="000000"/>
+              </w:rPr>
+              <w:t>會議記錄及簽到</w:t>
+            </w:r>
+          </w:p>
+        </w:tc>
+      </w:tr>
+      <w:tr>
+        <w:trPr>
+          <w:trHeight w:val="300"/>
+          <w:jc w:val="center"/>
+        </w:trPr>
+        <w:tc>
+          <w:tcPr>
+            <w:tcW w:w="2266" w:type="dxa"/>
+            <w:vAlign w:val="center"/>
+          </w:tcPr>
+          <w:p>
+            <w:pPr>
+              <w:jc w:val="center"/>
+              <w:rPr>
+                <w:rFonts w:ascii="標楷體" w:eastAsia="標楷體" w:hAnsi="標楷體" w:cs="標楷體"/>
+                <w:color w:val="000000"/>
+              </w:rPr>
+            </w:pPr>
+            <w:r>
+              <w:rPr>
+                <w:rFonts w:ascii="標楷體" w:eastAsia="標楷體" w:hAnsi="標楷體" w:cs="標楷體"/>
+                <w:b/>
+                <w:bCs/>
+                <w:color w:val="000000"/>
+              </w:rPr>
+              <w:t>攝影組</w:t>
             </w:r>
           </w:p>
         </w:tc>
@@ -2694,35 +2707,24 @@
             </w:pPr>
             <w:r>
               <w:rPr>
-                <w:rFonts w:ascii="標楷體" w:eastAsia="標楷體" w:hAnsi="標楷體" w:cs="標楷體"/>
-                <w:color w:val="000000"/>
-              </w:rPr>
-              <w:t>陳</w:t>
-            </w:r>
-            <w:proofErr w:type="gramStart"/>
-            <w:r>
-              <w:rPr>
-                <w:rFonts w:ascii="標楷體" w:eastAsia="標楷體" w:hAnsi="標楷體" w:cs="標楷體"/>
-                <w:color w:val="000000"/>
-              </w:rPr>
-              <w:t>淽潾</w:t>
-            </w:r>
-            <w:proofErr w:type="gramEnd"/>
-          </w:p>
-          <w:p>
-            <w:pPr>
-              <w:jc w:val="center"/>
-              <w:rPr>
-                <w:rFonts w:ascii="標楷體" w:eastAsia="標楷體" w:hAnsi="標楷體" w:cs="標楷體"/>
-                <w:color w:val="000000"/>
-              </w:rPr>
-            </w:pPr>
-            <w:r>
-              <w:rPr>
-                <w:rFonts w:ascii="標楷體" w:eastAsia="標楷體" w:hAnsi="標楷體" w:cs="標楷體"/>
-                <w:color w:val="000000"/>
-              </w:rPr>
-              <w:t>朱岑芯</w:t>
+                <w:rFonts w:ascii="標楷體" w:eastAsia="標楷體" w:hAnsi="標楷體"/>
+              </w:rPr>
+              <w:t>{{</w:t>
+            </w:r>
+            <w:r>
+              <w:rPr>
+                <w:rFonts w:ascii="標楷體" w:eastAsia="標楷體" w:hAnsi="標楷體" w:cs="標楷體"/>
+                <w:b/>
+                <w:bCs/>
+                <w:color w:val="000000"/>
+              </w:rPr>
+              <w:t>攝影組</w:t>
+            </w:r>
+            <w:r>
+              <w:rPr>
+                <w:rFonts w:ascii="標楷體" w:eastAsia="標楷體" w:hAnsi="標楷體"/>
+              </w:rPr>
+              <w:t>}}</w:t>
             </w:r>
           </w:p>
         </w:tc>
@@ -2745,7 +2747,7 @@
                 <w:rFonts w:ascii="標楷體" w:eastAsia="標楷體" w:hAnsi="標楷體" w:cs="標楷體"/>
                 <w:color w:val="000000"/>
               </w:rPr>
-              <w:t>會議記錄及簽到</w:t>
+              <w:t>拍攝記錄活動內容、活動後照片備檔</w:t>
             </w:r>
           </w:p>
         </w:tc>
@@ -2775,7 +2777,7 @@
                 <w:bCs/>
                 <w:color w:val="000000"/>
               </w:rPr>
-              <w:t>攝影組</w:t>
+              <w:t>總務組</w:t>
             </w:r>
           </w:p>
         </w:tc>
@@ -2786,50 +2788,32 @@
           </w:tcPr>
           <w:p>
             <w:pPr>
-              <w:widowControl/>
-              <w:pBdr>
-                <w:top w:val="nil"/>
-                <w:left w:val="nil"/>
-                <w:bottom w:val="nil"/>
-                <w:right w:val="nil"/>
-                <w:between w:val="nil"/>
-              </w:pBdr>
-              <w:jc w:val="center"/>
-              <w:rPr>
-                <w:rFonts w:ascii="標楷體" w:eastAsia="標楷體" w:hAnsi="標楷體" w:cs="標楷體"/>
-                <w:color w:val="000000"/>
-              </w:rPr>
-            </w:pPr>
-            <w:r>
-              <w:rPr>
-                <w:rFonts w:ascii="標楷體" w:eastAsia="標楷體" w:hAnsi="標楷體" w:cs="標楷體"/>
-                <w:color w:val="000000"/>
-              </w:rPr>
-              <w:t>葉宗頷</w:t>
-            </w:r>
-          </w:p>
-          <w:p>
-            <w:pPr>
-              <w:widowControl/>
-              <w:pBdr>
-                <w:top w:val="nil"/>
-                <w:left w:val="nil"/>
-                <w:bottom w:val="nil"/>
-                <w:right w:val="nil"/>
-                <w:between w:val="nil"/>
-              </w:pBdr>
-              <w:jc w:val="center"/>
-              <w:rPr>
-                <w:rFonts w:ascii="標楷體" w:eastAsia="標楷體" w:hAnsi="標楷體" w:cs="標楷體"/>
-                <w:color w:val="000000"/>
-              </w:rPr>
-            </w:pPr>
-            <w:r>
-              <w:rPr>
-                <w:rFonts w:ascii="標楷體" w:eastAsia="標楷體" w:hAnsi="標楷體" w:cs="標楷體"/>
-                <w:color w:val="000000"/>
-              </w:rPr>
-              <w:t>陳士璿</w:t>
+              <w:jc w:val="center"/>
+              <w:rPr>
+                <w:rFonts w:ascii="標楷體" w:eastAsia="標楷體" w:hAnsi="標楷體" w:cs="標楷體"/>
+                <w:color w:val="000000"/>
+              </w:rPr>
+            </w:pPr>
+            <w:r>
+              <w:rPr>
+                <w:rFonts w:ascii="標楷體" w:eastAsia="標楷體" w:hAnsi="標楷體"/>
+              </w:rPr>
+              <w:t>{{</w:t>
+            </w:r>
+            <w:r>
+              <w:rPr>
+                <w:rFonts w:ascii="標楷體" w:eastAsia="標楷體" w:hAnsi="標楷體" w:cs="標楷體"/>
+                <w:b/>
+                <w:bCs/>
+                <w:color w:val="000000"/>
+              </w:rPr>
+              <w:t>總務組</w:t>
+            </w:r>
+            <w:r>
+              <w:rPr>
+                <w:rFonts w:ascii="標楷體" w:eastAsia="標楷體" w:hAnsi="標楷體"/>
+              </w:rPr>
+              <w:t>}}</w:t>
             </w:r>
           </w:p>
         </w:tc>
@@ -2852,7 +2836,7 @@
                 <w:rFonts w:ascii="標楷體" w:eastAsia="標楷體" w:hAnsi="標楷體" w:cs="標楷體"/>
                 <w:color w:val="000000"/>
               </w:rPr>
-              <w:t>拍攝記錄活動內容、活動後照片備檔</w:t>
+              <w:t>收集活動收據、活動經費審核及核銷、場地佈置</w:t>
             </w:r>
           </w:p>
         </w:tc>
@@ -2882,7 +2866,7 @@
                 <w:bCs/>
                 <w:color w:val="000000"/>
               </w:rPr>
-              <w:t>總務組</w:t>
+              <w:t>公關組</w:t>
             </w:r>
           </w:p>
         </w:tc>
@@ -2893,89 +2877,18 @@
           </w:tcPr>
           <w:p>
             <w:pPr>
-              <w:widowControl/>
-              <w:pBdr>
-                <w:top w:val="nil"/>
-                <w:left w:val="nil"/>
-                <w:bottom w:val="nil"/>
-                <w:right w:val="nil"/>
-                <w:between w:val="nil"/>
-              </w:pBdr>
-              <w:jc w:val="center"/>
-              <w:rPr>
-                <w:rFonts w:ascii="標楷體" w:eastAsia="標楷體" w:hAnsi="標楷體" w:cs="標楷體"/>
-                <w:color w:val="000000"/>
-              </w:rPr>
-            </w:pPr>
-            <w:r>
-              <w:rPr>
-                <w:rFonts w:ascii="標楷體" w:eastAsia="標楷體" w:hAnsi="標楷體" w:cs="標楷體"/>
-                <w:color w:val="000000"/>
-              </w:rPr>
-              <w:t>蕭楷彥</w:t>
-            </w:r>
-          </w:p>
-          <w:p>
-            <w:pPr>
-              <w:jc w:val="center"/>
-              <w:rPr>
-                <w:rFonts w:ascii="標楷體" w:eastAsia="標楷體" w:hAnsi="標楷體" w:cs="標楷體"/>
-                <w:color w:val="000000"/>
-              </w:rPr>
-            </w:pPr>
-            <w:proofErr w:type="gramStart"/>
-            <w:r>
-              <w:rPr>
-                <w:rFonts w:ascii="標楷體" w:eastAsia="標楷體" w:hAnsi="標楷體" w:cs="標楷體"/>
-                <w:color w:val="000000"/>
-              </w:rPr>
-              <w:t>吳沐恩</w:t>
-            </w:r>
-            <w:proofErr w:type="gramEnd"/>
-          </w:p>
-        </w:tc>
-        <w:tc>
-          <w:tcPr>
-            <w:tcW w:w="6708" w:type="dxa"/>
-            <w:vAlign w:val="center"/>
-          </w:tcPr>
-          <w:p>
-            <w:pPr>
-              <w:spacing w:line="300" w:lineRule="auto"/>
-              <w:jc w:val="both"/>
-              <w:rPr>
-                <w:rFonts w:ascii="標楷體" w:eastAsia="標楷體" w:hAnsi="標楷體" w:cs="標楷體"/>
-                <w:color w:val="000000"/>
-              </w:rPr>
-            </w:pPr>
-            <w:r>
-              <w:rPr>
-                <w:rFonts w:ascii="標楷體" w:eastAsia="標楷體" w:hAnsi="標楷體" w:cs="標楷體"/>
-                <w:color w:val="000000"/>
-              </w:rPr>
-              <w:t>收集活動收據、活動經費審核及核銷、場地佈置</w:t>
-            </w:r>
-          </w:p>
-        </w:tc>
-      </w:tr>
-      <w:tr>
-        <w:trPr>
-          <w:trHeight w:val="300"/>
-          <w:jc w:val="center"/>
-        </w:trPr>
-        <w:tc>
-          <w:tcPr>
-            <w:tcW w:w="2266" w:type="dxa"/>
-            <w:vAlign w:val="center"/>
-          </w:tcPr>
-          <w:p>
-            <w:pPr>
-              <w:jc w:val="center"/>
-              <w:rPr>
-                <w:rFonts w:ascii="標楷體" w:eastAsia="標楷體" w:hAnsi="標楷體" w:cs="標楷體"/>
-                <w:color w:val="000000"/>
-              </w:rPr>
-            </w:pPr>
+              <w:jc w:val="center"/>
+              <w:rPr>
+                <w:rFonts w:ascii="標楷體" w:eastAsia="標楷體" w:hAnsi="標楷體" w:cs="標楷體"/>
+                <w:color w:val="000000"/>
+              </w:rPr>
+            </w:pPr>
+            <w:r>
+              <w:rPr>
+                <w:rFonts w:ascii="標楷體" w:eastAsia="標楷體" w:hAnsi="標楷體"/>
+              </w:rPr>
+              <w:t>{{</w:t>
+            </w:r>
             <w:r>
               <w:rPr>
                 <w:rFonts w:ascii="標楷體" w:eastAsia="標楷體" w:hAnsi="標楷體" w:cs="標楷體"/>
@@ -2985,85 +2898,12 @@
               </w:rPr>
               <w:t>公關組</w:t>
             </w:r>
-          </w:p>
-        </w:tc>
-        <w:tc>
-          <w:tcPr>
-            <w:tcW w:w="1599" w:type="dxa"/>
-            <w:vAlign w:val="center"/>
-          </w:tcPr>
-          <w:p>
-            <w:pPr>
-              <w:widowControl/>
-              <w:pBdr>
-                <w:top w:val="nil"/>
-                <w:left w:val="nil"/>
-                <w:bottom w:val="nil"/>
-                <w:right w:val="nil"/>
-                <w:between w:val="nil"/>
-              </w:pBdr>
-              <w:jc w:val="center"/>
-              <w:rPr>
-                <w:rFonts w:ascii="標楷體" w:eastAsia="標楷體" w:hAnsi="標楷體" w:cs="標楷體"/>
-                <w:color w:val="000000"/>
-              </w:rPr>
-            </w:pPr>
-            <w:r>
-              <w:rPr>
-                <w:rFonts w:ascii="標楷體" w:eastAsia="標楷體" w:hAnsi="標楷體" w:cs="標楷體"/>
-                <w:color w:val="000000"/>
-              </w:rPr>
-              <w:t>劉家君</w:t>
-            </w:r>
-          </w:p>
-          <w:p>
-            <w:pPr>
-              <w:widowControl/>
-              <w:pBdr>
-                <w:top w:val="nil"/>
-                <w:left w:val="nil"/>
-                <w:bottom w:val="nil"/>
-                <w:right w:val="nil"/>
-                <w:between w:val="nil"/>
-              </w:pBdr>
-              <w:jc w:val="center"/>
-              <w:rPr>
-                <w:rFonts w:ascii="標楷體" w:eastAsia="標楷體" w:hAnsi="標楷體" w:cs="標楷體"/>
-                <w:color w:val="000000"/>
-              </w:rPr>
-            </w:pPr>
-            <w:r>
-              <w:rPr>
-                <w:rFonts w:ascii="標楷體" w:eastAsia="標楷體" w:hAnsi="標楷體" w:cs="標楷體"/>
-                <w:color w:val="000000"/>
-              </w:rPr>
-              <w:t>蔡崴旭</w:t>
-            </w:r>
-          </w:p>
-          <w:p>
-            <w:pPr>
-              <w:jc w:val="center"/>
-              <w:rPr>
-                <w:rFonts w:ascii="標楷體" w:eastAsia="標楷體" w:hAnsi="標楷體" w:cs="標楷體"/>
-                <w:color w:val="000000"/>
-              </w:rPr>
-            </w:pPr>
-            <w:r>
-              <w:rPr>
-                <w:rFonts w:ascii="標楷體" w:eastAsia="標楷體" w:hAnsi="標楷體" w:cs="標楷體"/>
-                <w:color w:val="000000"/>
-              </w:rPr>
-              <w:t>張程</w:t>
-            </w:r>
-            <w:proofErr w:type="gramStart"/>
-            <w:r>
-              <w:rPr>
-                <w:rFonts w:ascii="標楷體" w:eastAsia="標楷體" w:hAnsi="標楷體" w:cs="標楷體"/>
-                <w:color w:val="000000"/>
-              </w:rPr>
-              <w:t>程</w:t>
-            </w:r>
-            <w:proofErr w:type="gramEnd"/>
+            <w:r>
+              <w:rPr>
+                <w:rFonts w:ascii="標楷體" w:eastAsia="標楷體" w:hAnsi="標楷體"/>
+              </w:rPr>
+              <w:t>}}</w:t>
+            </w:r>
           </w:p>
         </w:tc>
         <w:tc>
@@ -3306,29 +3146,9 @@
             </w:pPr>
             <w:r>
               <w:rPr>
-                <w:rFonts w:ascii="標楷體" w:eastAsia="標楷體" w:hAnsi="標楷體" w:cs="標楷體"/>
-                <w:color w:val="000000"/>
-              </w:rPr>
-              <w:t>115/</w:t>
-            </w:r>
-            <w:r>
-              <w:rPr>
-                <w:rFonts w:ascii="標楷體" w:eastAsia="標楷體" w:hAnsi="標楷體" w:cs="標楷體"/>
-              </w:rPr>
-              <w:t>5</w:t>
-            </w:r>
-            <w:r>
-              <w:rPr>
-                <w:rFonts w:ascii="標楷體" w:eastAsia="標楷體" w:hAnsi="標楷體" w:cs="標楷體"/>
-                <w:color w:val="000000"/>
-              </w:rPr>
-              <w:t>/</w:t>
-            </w:r>
-            <w:r>
-              <w:rPr>
-                <w:rFonts w:ascii="標楷體" w:eastAsia="標楷體" w:hAnsi="標楷體" w:cs="標楷體"/>
-              </w:rPr>
-              <w:t>12</w:t>
+                <w:rFonts w:ascii="標楷體" w:eastAsia="標楷體" w:hAnsi="標楷體"/>
+              </w:rPr>
+              <w:t>{{活動日期}}</w:t>
             </w:r>
           </w:p>
         </w:tc>
@@ -3404,23 +3224,7 @@
                 <w:rFonts w:ascii="標楷體" w:eastAsia="標楷體" w:hAnsi="標楷體" w:cs="標楷體"/>
                 <w:color w:val="000000"/>
               </w:rPr>
-              <w:t>搬桌椅、場地佈置、攝影組確認各項電腦設備與簡報、準備點心、佈置泡茶桌、黑板</w:t>
-            </w:r>
-            <w:proofErr w:type="gramStart"/>
-            <w:r>
-              <w:rPr>
-                <w:rFonts w:ascii="標楷體" w:eastAsia="標楷體" w:hAnsi="標楷體" w:cs="標楷體"/>
-                <w:color w:val="000000"/>
-              </w:rPr>
-              <w:t>板</w:t>
-            </w:r>
-            <w:proofErr w:type="gramEnd"/>
-            <w:r>
-              <w:rPr>
-                <w:rFonts w:ascii="標楷體" w:eastAsia="標楷體" w:hAnsi="標楷體" w:cs="標楷體"/>
-                <w:color w:val="000000"/>
-              </w:rPr>
-              <w:t>畫繪製、佈置簽到桌</w:t>
+              <w:t>搬桌椅、場地佈置、攝影組確認各項電腦設備與簡報、準備點心、佈置泡茶桌、黑板板畫繪製、佈置簽到桌</w:t>
             </w:r>
           </w:p>
         </w:tc>
@@ -3445,16 +3249,9 @@
             </w:pPr>
             <w:r>
               <w:rPr>
-                <w:rFonts w:ascii="標楷體" w:eastAsia="標楷體" w:hAnsi="標楷體" w:cs="標楷體"/>
-                <w:color w:val="000000"/>
-              </w:rPr>
-              <w:t>115/</w:t>
-            </w:r>
-            <w:r>
-              <w:rPr>
-                <w:rFonts w:ascii="標楷體" w:eastAsia="標楷體" w:hAnsi="標楷體" w:cs="標楷體"/>
-              </w:rPr>
-              <w:t>5/12</w:t>
+                <w:rFonts w:ascii="標楷體" w:eastAsia="標楷體" w:hAnsi="標楷體"/>
+              </w:rPr>
+              <w:t>{{活動日期}}</w:t>
             </w:r>
           </w:p>
         </w:tc>
@@ -3554,16 +3351,9 @@
             </w:pPr>
             <w:r>
               <w:rPr>
-                <w:rFonts w:ascii="標楷體" w:eastAsia="標楷體" w:hAnsi="標楷體" w:cs="標楷體"/>
-                <w:color w:val="000000"/>
-              </w:rPr>
-              <w:t>115/</w:t>
-            </w:r>
-            <w:r>
-              <w:rPr>
-                <w:rFonts w:ascii="標楷體" w:eastAsia="標楷體" w:hAnsi="標楷體" w:cs="標楷體"/>
-              </w:rPr>
-              <w:t>5/12</w:t>
+                <w:rFonts w:ascii="標楷體" w:eastAsia="標楷體" w:hAnsi="標楷體"/>
+              </w:rPr>
+              <w:t>{{活動日期}}</w:t>
             </w:r>
           </w:p>
         </w:tc>
@@ -3703,16 +3493,9 @@
             </w:pPr>
             <w:r>
               <w:rPr>
-                <w:rFonts w:ascii="標楷體" w:eastAsia="標楷體" w:hAnsi="標楷體" w:cs="標楷體"/>
-                <w:color w:val="000000"/>
-              </w:rPr>
-              <w:t>115/</w:t>
-            </w:r>
-            <w:r>
-              <w:rPr>
-                <w:rFonts w:ascii="標楷體" w:eastAsia="標楷體" w:hAnsi="標楷體" w:cs="標楷體"/>
-              </w:rPr>
-              <w:t>5/12</w:t>
+                <w:rFonts w:ascii="標楷體" w:eastAsia="標楷體" w:hAnsi="標楷體"/>
+              </w:rPr>
+              <w:t>{{活動日期}}</w:t>
             </w:r>
           </w:p>
         </w:tc>

</xml_diff>